<commit_message>
Remove separate service operations extension
</commit_message>
<xml_diff>
--- a/docs/submission/requirements_definition.docx
+++ b/docs/submission/requirements_definition.docx
@@ -13,7 +13,7 @@
           <w:color w:val="0B2545"/>
           <w:sz w:val="36"/>
         </w:rPr>
-        <w:t>AIOps 4-Agent 서비스 제어 자동화 요구사항 정의서</w:t>
+        <w:t>AIOps 4-Agent Kubernetes 장애 복구 연구 요구사항 정의서</w:t>
       </w:r>
     </w:p>
     <w:p>
@@ -26,27 +26,12 @@
           <w:color w:val="555555"/>
           <w:sz w:val="22"/>
         </w:rPr>
-        <w:t>AI 기반 서비스 제어 및 관리 자동화 프레임워크</w:t>
+        <w:t>Safety-Bounded Closed-Loop Autonomous 4-Agent AIOps Framework</w:t>
       </w:r>
     </w:p>
     <w:p>
       <w:r>
-        <w:t>본 문서는 AIOps 4-Agent 연구 프로토타입의 구현 범위, 기능 요구사항, 시험 방법, 산출물 구성을 정리한 제출용 요구사항 정의서이다.</w:t>
-      </w:r>
-    </w:p>
-    <w:p>
-      <w:r>
-        <w:rPr>
-          <w:rFonts w:ascii="Malgun Gothic" w:hAnsi="Malgun Gothic" w:eastAsia="Malgun Gothic"/>
-          <w:b/>
-        </w:rPr>
-        <w:t xml:space="preserve">핵심 정의: </w:t>
-      </w:r>
-      <w:r>
-        <w:rPr>
-          <w:rFonts w:ascii="Malgun Gothic" w:hAnsi="Malgun Gothic" w:eastAsia="Malgun Gothic"/>
-        </w:rPr>
-        <w:t>4개의 AI Agent가 장애 상태를 역할별로 판단하고, 구조화된 action과 reward 정책을 통해 Kubernetes 제어 명령을 안전하게 생성·검증·실행한다.</w:t>
+        <w:t>본 문서는 Kubernetes 서비스 장애 감시와 복구 자동화를 위한 4-Agent AIOps 연구 프로토타입의 구현 범위, 기능 요구사항, 시험 방법, 산출물 구성을 정리한다.</w:t>
       </w:r>
     </w:p>
     <w:p>
@@ -60,7 +45,7 @@
           <w:color w:val="2E74B5"/>
           <w:sz w:val="32"/>
         </w:rPr>
-        <w:t>1. 연구 개발 범위</w:t>
+        <w:t>1. 연구 목적</w:t>
       </w:r>
     </w:p>
     <w:p>
@@ -68,7 +53,11 @@
         <w:pStyle w:val="ListBullet"/>
       </w:pPr>
       <w:r>
-        <w:t>AI LLM 운영 관리 구조 설계 및 프로토타입</w:t>
+        <w:rPr>
+          <w:rFonts w:ascii="Malgun Gothic" w:hAnsi="Malgun Gothic" w:eastAsia="Malgun Gothic"/>
+          <w:sz w:val="21"/>
+        </w:rPr>
+        <w:t>4개의 AI Agent가 역할별로 장애를 판단하고 복구 action을 제안한다.</w:t>
       </w:r>
     </w:p>
     <w:p>
@@ -76,7 +65,11 @@
         <w:pStyle w:val="ListBullet"/>
       </w:pPr>
       <w:r>
-        <w:t>AI 에이전트 등록 관리 프로토타입</w:t>
+        <w:rPr>
+          <w:rFonts w:ascii="Malgun Gothic" w:hAnsi="Malgun Gothic" w:eastAsia="Malgun Gothic"/>
+          <w:sz w:val="21"/>
+        </w:rPr>
+        <w:t>Action/Reward 정책으로 Agent 판단을 교차 검증한다.</w:t>
       </w:r>
     </w:p>
     <w:p>
@@ -84,7 +77,11 @@
         <w:pStyle w:val="ListBullet"/>
       </w:pPr>
       <w:r>
-        <w:t>AI 응용 자동화 에이전트 설계 및 프로토타입</w:t>
+        <w:rPr>
+          <w:rFonts w:ascii="Malgun Gothic" w:hAnsi="Malgun Gothic" w:eastAsia="Malgun Gothic"/>
+          <w:sz w:val="21"/>
+        </w:rPr>
+        <w:t>Python Validator와 선택적 Go Guard를 통해 위험한 Kubernetes action을 차단한다.</w:t>
       </w:r>
     </w:p>
     <w:p>
@@ -92,23 +89,11 @@
         <w:pStyle w:val="ListBullet"/>
       </w:pPr>
       <w:r>
-        <w:t>CPU/GPU VM 기반 AI 응용 배포/제어 추론 최적화 전략</w:t>
-      </w:r>
-    </w:p>
-    <w:p>
-      <w:pPr>
-        <w:pStyle w:val="ListBullet"/>
-      </w:pPr>
-      <w:r>
-        <w:t>Go 언어 기반 최종 Kubernetes action guard</w:t>
-      </w:r>
-    </w:p>
-    <w:p>
-      <w:pPr>
-        <w:pStyle w:val="ListBullet"/>
-      </w:pPr>
-      <w:r>
-        <w:t>최소 2종 이상의 LLM/코딩 에이전트 관점 교차 검증</w:t>
+        <w:rPr>
+          <w:rFonts w:ascii="Malgun Gothic" w:hAnsi="Malgun Gothic" w:eastAsia="Malgun Gothic"/>
+          <w:sz w:val="21"/>
+        </w:rPr>
+        <w:t>Chaos Mesh, AIOpsLab, Prometheus, Kubernetes 환경에서 실험 결과를 수집한다.</w:t>
       </w:r>
     </w:p>
     <w:p>
@@ -161,7 +146,7 @@
         </w:tc>
         <w:tc>
           <w:tcPr>
-            <w:tcW w:type="dxa" w:w="6912"/>
+            <w:tcW w:type="dxa" w:w="7200"/>
             <w:vAlign w:val="center"/>
             <w:shd w:fill="F2F4F7"/>
           </w:tcPr>
@@ -182,7 +167,7 @@
         </w:tc>
         <w:tc>
           <w:tcPr>
-            <w:tcW w:type="dxa" w:w="1296"/>
+            <w:tcW w:type="dxa" w:w="1152"/>
             <w:vAlign w:val="center"/>
             <w:shd w:fill="F2F4F7"/>
           </w:tcPr>
@@ -225,7 +210,7 @@
         </w:tc>
         <w:tc>
           <w:tcPr>
-            <w:tcW w:type="dxa" w:w="6912"/>
+            <w:tcW w:type="dxa" w:w="7200"/>
             <w:vAlign w:val="center"/>
           </w:tcPr>
           <w:p>
@@ -239,13 +224,13 @@
                 <w:b w:val="0"/>
                 <w:sz w:val="19"/>
               </w:rPr>
-              <w:t>4-Agent 역할 분리 및 action/reward 정책 설계</w:t>
+              <w:t>장애 입력을 구조화된 AlertEvent로 변환</w:t>
             </w:r>
           </w:p>
         </w:tc>
         <w:tc>
           <w:tcPr>
-            <w:tcW w:type="dxa" w:w="1296"/>
+            <w:tcW w:type="dxa" w:w="1152"/>
             <w:vAlign w:val="center"/>
           </w:tcPr>
           <w:p>
@@ -287,7 +272,7 @@
         </w:tc>
         <w:tc>
           <w:tcPr>
-            <w:tcW w:type="dxa" w:w="6912"/>
+            <w:tcW w:type="dxa" w:w="7200"/>
             <w:vAlign w:val="center"/>
           </w:tcPr>
           <w:p>
@@ -301,13 +286,13 @@
                 <w:b w:val="0"/>
                 <w:sz w:val="19"/>
               </w:rPr>
-              <w:t>AutoGen GroupChat 기반 Agent 대화 경로</w:t>
+              <w:t>HA Agent의 장애 원인 및 복구 필요성 판단</w:t>
             </w:r>
           </w:p>
         </w:tc>
         <w:tc>
           <w:tcPr>
-            <w:tcW w:type="dxa" w:w="1296"/>
+            <w:tcW w:type="dxa" w:w="1152"/>
             <w:vAlign w:val="center"/>
           </w:tcPr>
           <w:p>
@@ -349,7 +334,7 @@
         </w:tc>
         <w:tc>
           <w:tcPr>
-            <w:tcW w:type="dxa" w:w="6912"/>
+            <w:tcW w:type="dxa" w:w="7200"/>
             <w:vAlign w:val="center"/>
           </w:tcPr>
           <w:p>
@@ -363,13 +348,13 @@
                 <w:b w:val="0"/>
                 <w:sz w:val="19"/>
               </w:rPr>
-              <w:t>Prometheus metric 입력 기반 실행 경로</w:t>
+              <w:t>Application Agent의 bounded recovery action 후보 생성</w:t>
             </w:r>
           </w:p>
         </w:tc>
         <w:tc>
           <w:tcPr>
-            <w:tcW w:type="dxa" w:w="1296"/>
+            <w:tcW w:type="dxa" w:w="1152"/>
             <w:vAlign w:val="center"/>
           </w:tcPr>
           <w:p>
@@ -411,7 +396,7 @@
         </w:tc>
         <w:tc>
           <w:tcPr>
-            <w:tcW w:type="dxa" w:w="6912"/>
+            <w:tcW w:type="dxa" w:w="7200"/>
             <w:vAlign w:val="center"/>
           </w:tcPr>
           <w:p>
@@ -425,13 +410,13 @@
                 <w:b w:val="0"/>
                 <w:sz w:val="19"/>
               </w:rPr>
-              <w:t>Chaos Mesh 장애 4종 실험</w:t>
+              <w:t>Infrastructure Agent의 replica/deployment 안전성 검토</w:t>
             </w:r>
           </w:p>
         </w:tc>
         <w:tc>
           <w:tcPr>
-            <w:tcW w:type="dxa" w:w="1296"/>
+            <w:tcW w:type="dxa" w:w="1152"/>
             <w:vAlign w:val="center"/>
           </w:tcPr>
           <w:p>
@@ -473,7 +458,7 @@
         </w:tc>
         <w:tc>
           <w:tcPr>
-            <w:tcW w:type="dxa" w:w="6912"/>
+            <w:tcW w:type="dxa" w:w="7200"/>
             <w:vAlign w:val="center"/>
           </w:tcPr>
           <w:p>
@@ -487,13 +472,13 @@
                 <w:b w:val="0"/>
                 <w:sz w:val="19"/>
               </w:rPr>
-              <w:t>AIOpsLab Hotel Reservation 탐지 benchmark 연동</w:t>
+              <w:t>Cost Agent의 비용 및 과잉 action 검토</w:t>
             </w:r>
           </w:p>
         </w:tc>
         <w:tc>
           <w:tcPr>
-            <w:tcW w:type="dxa" w:w="1296"/>
+            <w:tcW w:type="dxa" w:w="1152"/>
             <w:vAlign w:val="center"/>
           </w:tcPr>
           <w:p>
@@ -535,7 +520,7 @@
         </w:tc>
         <w:tc>
           <w:tcPr>
-            <w:tcW w:type="dxa" w:w="6912"/>
+            <w:tcW w:type="dxa" w:w="7200"/>
             <w:vAlign w:val="center"/>
           </w:tcPr>
           <w:p>
@@ -549,13 +534,13 @@
                 <w:b w:val="0"/>
                 <w:sz w:val="19"/>
               </w:rPr>
-              <w:t>Kubernetes dry-run/real 제어 및 상태 확인</w:t>
+              <w:t>Python Validator 기반 allowlist와 replica limit 검증</w:t>
             </w:r>
           </w:p>
         </w:tc>
         <w:tc>
           <w:tcPr>
-            <w:tcW w:type="dxa" w:w="1296"/>
+            <w:tcW w:type="dxa" w:w="1152"/>
             <w:vAlign w:val="center"/>
           </w:tcPr>
           <w:p>
@@ -597,7 +582,7 @@
         </w:tc>
         <w:tc>
           <w:tcPr>
-            <w:tcW w:type="dxa" w:w="6912"/>
+            <w:tcW w:type="dxa" w:w="7200"/>
             <w:vAlign w:val="center"/>
           </w:tcPr>
           <w:p>
@@ -611,13 +596,13 @@
                 <w:b w:val="0"/>
                 <w:sz w:val="19"/>
               </w:rPr>
-              <w:t>Go 언어 기반 최종 action guard</w:t>
+              <w:t>선택적 Go Guard 기반 이중 안전 검증</w:t>
             </w:r>
           </w:p>
         </w:tc>
         <w:tc>
           <w:tcPr>
-            <w:tcW w:type="dxa" w:w="1296"/>
+            <w:tcW w:type="dxa" w:w="1152"/>
             <w:vAlign w:val="center"/>
           </w:tcPr>
           <w:p>
@@ -659,7 +644,7 @@
         </w:tc>
         <w:tc>
           <w:tcPr>
-            <w:tcW w:type="dxa" w:w="6912"/>
+            <w:tcW w:type="dxa" w:w="7200"/>
             <w:vAlign w:val="center"/>
           </w:tcPr>
           <w:p>
@@ -673,13 +658,13 @@
                 <w:b w:val="0"/>
                 <w:sz w:val="19"/>
               </w:rPr>
-              <w:t>Agent 등록 관리 프로토타입</w:t>
+              <w:t>mock, dry-run, real 실행 모드 제공</w:t>
             </w:r>
           </w:p>
         </w:tc>
         <w:tc>
           <w:tcPr>
-            <w:tcW w:type="dxa" w:w="1296"/>
+            <w:tcW w:type="dxa" w:w="1152"/>
             <w:vAlign w:val="center"/>
           </w:tcPr>
           <w:p>
@@ -721,7 +706,7 @@
         </w:tc>
         <w:tc>
           <w:tcPr>
-            <w:tcW w:type="dxa" w:w="6912"/>
+            <w:tcW w:type="dxa" w:w="7200"/>
             <w:vAlign w:val="center"/>
           </w:tcPr>
           <w:p>
@@ -735,13 +720,13 @@
                 <w:b w:val="0"/>
                 <w:sz w:val="19"/>
               </w:rPr>
-              <w:t>CPU/GPU VM 기반 추론 배치 최적화 추천</w:t>
+              <w:t>Chaos Mesh 기반 4종 장애 반복 실험</w:t>
             </w:r>
           </w:p>
         </w:tc>
         <w:tc>
           <w:tcPr>
-            <w:tcW w:type="dxa" w:w="1296"/>
+            <w:tcW w:type="dxa" w:w="1152"/>
             <w:vAlign w:val="center"/>
           </w:tcPr>
           <w:p>
@@ -783,7 +768,7 @@
         </w:tc>
         <w:tc>
           <w:tcPr>
-            <w:tcW w:type="dxa" w:w="6912"/>
+            <w:tcW w:type="dxa" w:w="7200"/>
             <w:vAlign w:val="center"/>
           </w:tcPr>
           <w:p>
@@ -797,13 +782,13 @@
                 <w:b w:val="0"/>
                 <w:sz w:val="19"/>
               </w:rPr>
-              <w:t>Reward 정책 변화와 장애별 action ranking 비교</w:t>
+              <w:t>JSONL/CSV/Markdown/PNG/SVG 결과 산출</w:t>
             </w:r>
           </w:p>
         </w:tc>
         <w:tc>
           <w:tcPr>
-            <w:tcW w:type="dxa" w:w="1296"/>
+            <w:tcW w:type="dxa" w:w="1152"/>
             <w:vAlign w:val="center"/>
           </w:tcPr>
           <w:p>
@@ -822,68 +807,6 @@
           </w:p>
         </w:tc>
       </w:tr>
-      <w:tr>
-        <w:tc>
-          <w:tcPr>
-            <w:tcW w:type="dxa" w:w="1152"/>
-            <w:vAlign w:val="center"/>
-          </w:tcPr>
-          <w:p>
-            <w:pPr>
-              <w:spacing w:after="0"/>
-            </w:pPr>
-            <w:r/>
-            <w:r>
-              <w:rPr>
-                <w:rFonts w:ascii="Malgun Gothic" w:hAnsi="Malgun Gothic" w:eastAsia="Malgun Gothic"/>
-                <w:b w:val="0"/>
-                <w:sz w:val="19"/>
-              </w:rPr>
-              <w:t>FR-11</w:t>
-            </w:r>
-          </w:p>
-        </w:tc>
-        <w:tc>
-          <w:tcPr>
-            <w:tcW w:type="dxa" w:w="6912"/>
-            <w:vAlign w:val="center"/>
-          </w:tcPr>
-          <w:p>
-            <w:pPr>
-              <w:spacing w:after="0"/>
-            </w:pPr>
-            <w:r/>
-            <w:r>
-              <w:rPr>
-                <w:rFonts w:ascii="Malgun Gothic" w:hAnsi="Malgun Gothic" w:eastAsia="Malgun Gothic"/>
-                <w:b w:val="0"/>
-                <w:sz w:val="19"/>
-              </w:rPr>
-              <w:t>HTTP API 서버 형태의 Agent Registry 서비스</w:t>
-            </w:r>
-          </w:p>
-        </w:tc>
-        <w:tc>
-          <w:tcPr>
-            <w:tcW w:type="dxa" w:w="1296"/>
-            <w:vAlign w:val="center"/>
-          </w:tcPr>
-          <w:p>
-            <w:pPr>
-              <w:spacing w:after="0"/>
-            </w:pPr>
-            <w:r/>
-            <w:r>
-              <w:rPr>
-                <w:rFonts w:ascii="Malgun Gothic" w:hAnsi="Malgun Gothic" w:eastAsia="Malgun Gothic"/>
-                <w:b w:val="0"/>
-                <w:sz w:val="19"/>
-              </w:rPr>
-              <w:t>향후 확장</w:t>
-            </w:r>
-          </w:p>
-        </w:tc>
-      </w:tr>
     </w:tbl>
     <w:p/>
     <w:p>
@@ -897,7 +820,7 @@
           <w:color w:val="2E74B5"/>
           <w:sz w:val="32"/>
         </w:rPr>
-        <w:t>3. Agent 역할 정의</w:t>
+        <w:t>3. Agent 역할</w:t>
       </w:r>
     </w:p>
     <w:tbl>
@@ -936,7 +859,7 @@
         </w:tc>
         <w:tc>
           <w:tcPr>
-            <w:tcW w:type="dxa" w:w="4896"/>
+            <w:tcW w:type="dxa" w:w="5040"/>
             <w:vAlign w:val="center"/>
             <w:shd w:fill="F2F4F7"/>
           </w:tcPr>
@@ -957,7 +880,7 @@
         </w:tc>
         <w:tc>
           <w:tcPr>
-            <w:tcW w:type="dxa" w:w="1584"/>
+            <w:tcW w:type="dxa" w:w="1728"/>
             <w:vAlign w:val="center"/>
             <w:shd w:fill="F2F4F7"/>
           </w:tcPr>
@@ -1000,7 +923,7 @@
         </w:tc>
         <w:tc>
           <w:tcPr>
-            <w:tcW w:type="dxa" w:w="4896"/>
+            <w:tcW w:type="dxa" w:w="5040"/>
             <w:vAlign w:val="center"/>
           </w:tcPr>
           <w:p>
@@ -1014,13 +937,13 @@
                 <w:b w:val="0"/>
                 <w:sz w:val="19"/>
               </w:rPr>
-              <w:t>장애 진단, 가용성 판단, 자율 복구 필요성 평가</w:t>
+              <w:t>서비스 장애 진단, 가용성 판단, 복구 필요성 평가</w:t>
             </w:r>
           </w:p>
         </w:tc>
         <w:tc>
           <w:tcPr>
-            <w:tcW w:type="dxa" w:w="1584"/>
+            <w:tcW w:type="dxa" w:w="1728"/>
             <w:vAlign w:val="center"/>
           </w:tcPr>
           <w:p>
@@ -1062,7 +985,7 @@
         </w:tc>
         <w:tc>
           <w:tcPr>
-            <w:tcW w:type="dxa" w:w="4896"/>
+            <w:tcW w:type="dxa" w:w="5040"/>
             <w:vAlign w:val="center"/>
           </w:tcPr>
           <w:p>
@@ -1076,13 +999,13 @@
                 <w:b w:val="0"/>
                 <w:sz w:val="19"/>
               </w:rPr>
-              <w:t>응용 배포, 복구 action 선택, Kubernetes 제어</w:t>
+              <w:t>observe, restart, scale-out action 후보 생성</w:t>
             </w:r>
           </w:p>
         </w:tc>
         <w:tc>
           <w:tcPr>
-            <w:tcW w:type="dxa" w:w="1584"/>
+            <w:tcW w:type="dxa" w:w="1728"/>
             <w:vAlign w:val="center"/>
           </w:tcPr>
           <w:p>
@@ -1124,7 +1047,7 @@
         </w:tc>
         <w:tc>
           <w:tcPr>
-            <w:tcW w:type="dxa" w:w="4896"/>
+            <w:tcW w:type="dxa" w:w="5040"/>
             <w:vAlign w:val="center"/>
           </w:tcPr>
           <w:p>
@@ -1138,13 +1061,13 @@
                 <w:b w:val="0"/>
                 <w:sz w:val="19"/>
               </w:rPr>
-              <w:t>CPU/GPU/NPU 자원 수용성 및 VM 배치 가능성 검증</w:t>
+              <w:t>Kubernetes replica/deployment 안전성 검토</w:t>
             </w:r>
           </w:p>
         </w:tc>
         <w:tc>
           <w:tcPr>
-            <w:tcW w:type="dxa" w:w="1584"/>
+            <w:tcW w:type="dxa" w:w="1728"/>
             <w:vAlign w:val="center"/>
           </w:tcPr>
           <w:p>
@@ -1186,7 +1109,7 @@
         </w:tc>
         <w:tc>
           <w:tcPr>
-            <w:tcW w:type="dxa" w:w="4896"/>
+            <w:tcW w:type="dxa" w:w="5040"/>
             <w:vAlign w:val="center"/>
           </w:tcPr>
           <w:p>
@@ -1200,13 +1123,13 @@
                 <w:b w:val="0"/>
                 <w:sz w:val="19"/>
               </w:rPr>
-              <w:t>자원 사용량과 비용 정책 검증</w:t>
+              <w:t>비용 증가와 과잉 action 검토</w:t>
             </w:r>
           </w:p>
         </w:tc>
         <w:tc>
           <w:tcPr>
-            <w:tcW w:type="dxa" w:w="1584"/>
+            <w:tcW w:type="dxa" w:w="1728"/>
             <w:vAlign w:val="center"/>
           </w:tcPr>
           <w:p>
@@ -1238,291 +1161,7 @@
           <w:color w:val="2E74B5"/>
           <w:sz w:val="32"/>
         </w:rPr>
-        <w:t>4. CPU/GPU VM 추론 최적화 전략</w:t>
-      </w:r>
-    </w:p>
-    <w:p>
-      <w:r>
-        <w:t>추론 최적화 모듈은 workload의 accelerator 필요 여부, VRAM 요구량, latency SLO, throughput 요구량, VM 비용, 가용 replica 수를 기준으로 CPU/GPU VM 후보를 평가한다.</w:t>
-      </w:r>
-    </w:p>
-    <w:tbl>
-      <w:tblPr>
-        <w:tblStyle w:val="TableGrid"/>
-        <w:tblW w:type="auto" w:w="0"/>
-        <w:jc w:val="center"/>
-        <w:tblLook w:firstColumn="1" w:firstRow="1" w:lastColumn="0" w:lastRow="0" w:noHBand="0" w:noVBand="1" w:val="04A0"/>
-      </w:tblPr>
-      <w:tblGrid>
-        <w:gridCol w:w="2340"/>
-        <w:gridCol w:w="2340"/>
-        <w:gridCol w:w="2340"/>
-        <w:gridCol w:w="2340"/>
-      </w:tblGrid>
-      <w:tr>
-        <w:tc>
-          <w:tcPr>
-            <w:tcW w:type="dxa" w:w="2448"/>
-            <w:vAlign w:val="center"/>
-            <w:shd w:fill="F2F4F7"/>
-          </w:tcPr>
-          <w:p>
-            <w:pPr>
-              <w:spacing w:after="0"/>
-            </w:pPr>
-            <w:r/>
-            <w:r>
-              <w:rPr>
-                <w:rFonts w:ascii="Malgun Gothic" w:hAnsi="Malgun Gothic" w:eastAsia="Malgun Gothic"/>
-                <w:b/>
-                <w:sz w:val="19"/>
-              </w:rPr>
-              <w:t>Workload</w:t>
-            </w:r>
-          </w:p>
-        </w:tc>
-        <w:tc>
-          <w:tcPr>
-            <w:tcW w:type="dxa" w:w="2016"/>
-            <w:vAlign w:val="center"/>
-            <w:shd w:fill="F2F4F7"/>
-          </w:tcPr>
-          <w:p>
-            <w:pPr>
-              <w:spacing w:after="0"/>
-            </w:pPr>
-            <w:r/>
-            <w:r>
-              <w:rPr>
-                <w:rFonts w:ascii="Malgun Gothic" w:hAnsi="Malgun Gothic" w:eastAsia="Malgun Gothic"/>
-                <w:b/>
-                <w:sz w:val="19"/>
-              </w:rPr>
-              <w:t>선택 Resource</w:t>
-            </w:r>
-          </w:p>
-        </w:tc>
-        <w:tc>
-          <w:tcPr>
-            <w:tcW w:type="dxa" w:w="2160"/>
-            <w:vAlign w:val="center"/>
-            <w:shd w:fill="F2F4F7"/>
-          </w:tcPr>
-          <w:p>
-            <w:pPr>
-              <w:spacing w:after="0"/>
-            </w:pPr>
-            <w:r/>
-            <w:r>
-              <w:rPr>
-                <w:rFonts w:ascii="Malgun Gothic" w:hAnsi="Malgun Gothic" w:eastAsia="Malgun Gothic"/>
-                <w:b/>
-                <w:sz w:val="19"/>
-              </w:rPr>
-              <w:t>Action</w:t>
-            </w:r>
-          </w:p>
-        </w:tc>
-        <w:tc>
-          <w:tcPr>
-            <w:tcW w:type="dxa" w:w="2736"/>
-            <w:vAlign w:val="center"/>
-            <w:shd w:fill="F2F4F7"/>
-          </w:tcPr>
-          <w:p>
-            <w:pPr>
-              <w:spacing w:after="0"/>
-            </w:pPr>
-            <w:r/>
-            <w:r>
-              <w:rPr>
-                <w:rFonts w:ascii="Malgun Gothic" w:hAnsi="Malgun Gothic" w:eastAsia="Malgun Gothic"/>
-                <w:b/>
-                <w:sz w:val="19"/>
-              </w:rPr>
-              <w:t>판단 근거</w:t>
-            </w:r>
-          </w:p>
-        </w:tc>
-      </w:tr>
-      <w:tr>
-        <w:tc>
-          <w:tcPr>
-            <w:tcW w:type="dxa" w:w="2448"/>
-            <w:vAlign w:val="center"/>
-          </w:tcPr>
-          <w:p>
-            <w:pPr>
-              <w:spacing w:after="0"/>
-            </w:pPr>
-            <w:r/>
-            <w:r>
-              <w:rPr>
-                <w:rFonts w:ascii="Malgun Gothic" w:hAnsi="Malgun Gothic" w:eastAsia="Malgun Gothic"/>
-                <w:b w:val="0"/>
-                <w:sz w:val="19"/>
-              </w:rPr>
-              <w:t>llm-chat-inference</w:t>
-            </w:r>
-          </w:p>
-        </w:tc>
-        <w:tc>
-          <w:tcPr>
-            <w:tcW w:type="dxa" w:w="2016"/>
-            <w:vAlign w:val="center"/>
-          </w:tcPr>
-          <w:p>
-            <w:pPr>
-              <w:spacing w:after="0"/>
-            </w:pPr>
-            <w:r/>
-            <w:r>
-              <w:rPr>
-                <w:rFonts w:ascii="Malgun Gothic" w:hAnsi="Malgun Gothic" w:eastAsia="Malgun Gothic"/>
-                <w:b w:val="0"/>
-                <w:sz w:val="19"/>
-              </w:rPr>
-              <w:t>gpu-vm-l4</w:t>
-            </w:r>
-          </w:p>
-        </w:tc>
-        <w:tc>
-          <w:tcPr>
-            <w:tcW w:type="dxa" w:w="2160"/>
-            <w:vAlign w:val="center"/>
-          </w:tcPr>
-          <w:p>
-            <w:pPr>
-              <w:spacing w:after="0"/>
-            </w:pPr>
-            <w:r/>
-            <w:r>
-              <w:rPr>
-                <w:rFonts w:ascii="Malgun Gothic" w:hAnsi="Malgun Gothic" w:eastAsia="Malgun Gothic"/>
-                <w:b w:val="0"/>
-                <w:sz w:val="19"/>
-              </w:rPr>
-              <w:t>deploy_on_gpu_vm</w:t>
-            </w:r>
-          </w:p>
-        </w:tc>
-        <w:tc>
-          <w:tcPr>
-            <w:tcW w:type="dxa" w:w="2736"/>
-            <w:vAlign w:val="center"/>
-          </w:tcPr>
-          <w:p>
-            <w:pPr>
-              <w:spacing w:after="0"/>
-            </w:pPr>
-            <w:r/>
-            <w:r>
-              <w:rPr>
-                <w:rFonts w:ascii="Malgun Gothic" w:hAnsi="Malgun Gothic" w:eastAsia="Malgun Gothic"/>
-                <w:b w:val="0"/>
-                <w:sz w:val="19"/>
-              </w:rPr>
-              <w:t>LLM은 GPU가 필요하며 L4가 SLO와 비용 균형을 만족</w:t>
-            </w:r>
-          </w:p>
-        </w:tc>
-      </w:tr>
-      <w:tr>
-        <w:tc>
-          <w:tcPr>
-            <w:tcW w:type="dxa" w:w="2448"/>
-            <w:vAlign w:val="center"/>
-          </w:tcPr>
-          <w:p>
-            <w:pPr>
-              <w:spacing w:after="0"/>
-            </w:pPr>
-            <w:r/>
-            <w:r>
-              <w:rPr>
-                <w:rFonts w:ascii="Malgun Gothic" w:hAnsi="Malgun Gothic" w:eastAsia="Malgun Gothic"/>
-                <w:b w:val="0"/>
-                <w:sz w:val="19"/>
-              </w:rPr>
-              <w:t>text-classifier</w:t>
-            </w:r>
-          </w:p>
-        </w:tc>
-        <w:tc>
-          <w:tcPr>
-            <w:tcW w:type="dxa" w:w="2016"/>
-            <w:vAlign w:val="center"/>
-          </w:tcPr>
-          <w:p>
-            <w:pPr>
-              <w:spacing w:after="0"/>
-            </w:pPr>
-            <w:r/>
-            <w:r>
-              <w:rPr>
-                <w:rFonts w:ascii="Malgun Gothic" w:hAnsi="Malgun Gothic" w:eastAsia="Malgun Gothic"/>
-                <w:b w:val="0"/>
-                <w:sz w:val="19"/>
-              </w:rPr>
-              <w:t>cpu-vm-standard</w:t>
-            </w:r>
-          </w:p>
-        </w:tc>
-        <w:tc>
-          <w:tcPr>
-            <w:tcW w:type="dxa" w:w="2160"/>
-            <w:vAlign w:val="center"/>
-          </w:tcPr>
-          <w:p>
-            <w:pPr>
-              <w:spacing w:after="0"/>
-            </w:pPr>
-            <w:r/>
-            <w:r>
-              <w:rPr>
-                <w:rFonts w:ascii="Malgun Gothic" w:hAnsi="Malgun Gothic" w:eastAsia="Malgun Gothic"/>
-                <w:b w:val="0"/>
-                <w:sz w:val="19"/>
-              </w:rPr>
-              <w:t>deploy_on_cpu_vm</w:t>
-            </w:r>
-          </w:p>
-        </w:tc>
-        <w:tc>
-          <w:tcPr>
-            <w:tcW w:type="dxa" w:w="2736"/>
-            <w:vAlign w:val="center"/>
-          </w:tcPr>
-          <w:p>
-            <w:pPr>
-              <w:spacing w:after="0"/>
-            </w:pPr>
-            <w:r/>
-            <w:r>
-              <w:rPr>
-                <w:rFonts w:ascii="Malgun Gothic" w:hAnsi="Malgun Gothic" w:eastAsia="Malgun Gothic"/>
-                <w:b w:val="0"/>
-                <w:sz w:val="19"/>
-              </w:rPr>
-              <w:t>CPU VM으로도 SLO를 만족하여 비용 효율적</w:t>
-            </w:r>
-          </w:p>
-        </w:tc>
-      </w:tr>
-    </w:tbl>
-    <w:p/>
-    <w:p>
-      <w:pPr>
-        <w:pStyle w:val="Heading1"/>
-      </w:pPr>
-      <w:r>
-        <w:rPr>
-          <w:rFonts w:ascii="Malgun Gothic" w:hAnsi="Malgun Gothic" w:eastAsia="Malgun Gothic"/>
-          <w:b/>
-          <w:color w:val="2E74B5"/>
-          <w:sz w:val="32"/>
-        </w:rPr>
-        <w:t>5. 시험 및 검증 방법</w:t>
+        <w:t>4. 시험 방법</w:t>
       </w:r>
     </w:p>
     <w:tbl>
@@ -1540,7 +1179,7 @@
       <w:tr>
         <w:tc>
           <w:tcPr>
-            <w:tcW w:type="dxa" w:w="2016"/>
+            <w:tcW w:type="dxa" w:w="2160"/>
             <w:vAlign w:val="center"/>
             <w:shd w:fill="F2F4F7"/>
           </w:tcPr>
@@ -1561,7 +1200,7 @@
         </w:tc>
         <w:tc>
           <w:tcPr>
-            <w:tcW w:type="dxa" w:w="3744"/>
+            <w:tcW w:type="dxa" w:w="3888"/>
             <w:vAlign w:val="center"/>
             <w:shd w:fill="F2F4F7"/>
           </w:tcPr>
@@ -1582,7 +1221,7 @@
         </w:tc>
         <w:tc>
           <w:tcPr>
-            <w:tcW w:type="dxa" w:w="3600"/>
+            <w:tcW w:type="dxa" w:w="3312"/>
             <w:vAlign w:val="center"/>
             <w:shd w:fill="F2F4F7"/>
           </w:tcPr>
@@ -1605,7 +1244,7 @@
       <w:tr>
         <w:tc>
           <w:tcPr>
-            <w:tcW w:type="dxa" w:w="2016"/>
+            <w:tcW w:type="dxa" w:w="2160"/>
             <w:vAlign w:val="center"/>
           </w:tcPr>
           <w:p>
@@ -1625,7 +1264,7 @@
         </w:tc>
         <w:tc>
           <w:tcPr>
-            <w:tcW w:type="dxa" w:w="3744"/>
+            <w:tcW w:type="dxa" w:w="3888"/>
             <w:vAlign w:val="center"/>
           </w:tcPr>
           <w:p>
@@ -1645,7 +1284,7 @@
         </w:tc>
         <w:tc>
           <w:tcPr>
-            <w:tcW w:type="dxa" w:w="3600"/>
+            <w:tcW w:type="dxa" w:w="3312"/>
             <w:vAlign w:val="center"/>
           </w:tcPr>
           <w:p>
@@ -1667,7 +1306,7 @@
       <w:tr>
         <w:tc>
           <w:tcPr>
-            <w:tcW w:type="dxa" w:w="2016"/>
+            <w:tcW w:type="dxa" w:w="2160"/>
             <w:vAlign w:val="center"/>
           </w:tcPr>
           <w:p>
@@ -1681,13 +1320,13 @@
                 <w:b w:val="0"/>
                 <w:sz w:val="19"/>
               </w:rPr>
-              <w:t>Go guard 테스트</w:t>
+              <w:t>Go Guard 테스트</w:t>
             </w:r>
           </w:p>
         </w:tc>
         <w:tc>
           <w:tcPr>
-            <w:tcW w:type="dxa" w:w="3744"/>
+            <w:tcW w:type="dxa" w:w="3888"/>
             <w:vAlign w:val="center"/>
           </w:tcPr>
           <w:p>
@@ -1707,7 +1346,7 @@
         </w:tc>
         <w:tc>
           <w:tcPr>
-            <w:tcW w:type="dxa" w:w="3600"/>
+            <w:tcW w:type="dxa" w:w="3312"/>
             <w:vAlign w:val="center"/>
           </w:tcPr>
           <w:p>
@@ -1721,7 +1360,7 @@
                 <w:b w:val="0"/>
                 <w:sz w:val="19"/>
               </w:rPr>
-              <w:t>Go validator 테스트 통과</w:t>
+              <w:t>Go guard 테스트 통과</w:t>
             </w:r>
           </w:p>
         </w:tc>
@@ -1729,7 +1368,7 @@
       <w:tr>
         <w:tc>
           <w:tcPr>
-            <w:tcW w:type="dxa" w:w="2016"/>
+            <w:tcW w:type="dxa" w:w="2160"/>
             <w:vAlign w:val="center"/>
           </w:tcPr>
           <w:p>
@@ -1749,7 +1388,7 @@
         </w:tc>
         <w:tc>
           <w:tcPr>
-            <w:tcW w:type="dxa" w:w="3744"/>
+            <w:tcW w:type="dxa" w:w="3888"/>
             <w:vAlign w:val="center"/>
           </w:tcPr>
           <w:p>
@@ -1769,7 +1408,7 @@
         </w:tc>
         <w:tc>
           <w:tcPr>
-            <w:tcW w:type="dxa" w:w="3600"/>
+            <w:tcW w:type="dxa" w:w="3312"/>
             <w:vAlign w:val="center"/>
           </w:tcPr>
           <w:p>
@@ -1791,7 +1430,7 @@
       <w:tr>
         <w:tc>
           <w:tcPr>
-            <w:tcW w:type="dxa" w:w="2016"/>
+            <w:tcW w:type="dxa" w:w="2160"/>
             <w:vAlign w:val="center"/>
           </w:tcPr>
           <w:p>
@@ -1805,13 +1444,13 @@
                 <w:b w:val="0"/>
                 <w:sz w:val="19"/>
               </w:rPr>
-              <w:t>Inference Optimizer</w:t>
+              <w:t>Autonomous mock</w:t>
             </w:r>
           </w:p>
         </w:tc>
         <w:tc>
           <w:tcPr>
-            <w:tcW w:type="dxa" w:w="3744"/>
+            <w:tcW w:type="dxa" w:w="3888"/>
             <w:vAlign w:val="center"/>
           </w:tcPr>
           <w:p>
@@ -1825,13 +1464,13 @@
                 <w:b w:val="0"/>
                 <w:sz w:val="19"/>
               </w:rPr>
-              <w:t>recommend-inference-placement</w:t>
+              <w:t>aiops-k8s-agents autonomous-run</w:t>
             </w:r>
           </w:p>
         </w:tc>
         <w:tc>
           <w:tcPr>
-            <w:tcW w:type="dxa" w:w="3600"/>
+            <w:tcW w:type="dxa" w:w="3312"/>
             <w:vAlign w:val="center"/>
           </w:tcPr>
           <w:p>
@@ -1845,7 +1484,7 @@
                 <w:b w:val="0"/>
                 <w:sz w:val="19"/>
               </w:rPr>
-              <w:t>워크로드별 적합 VM 추천</w:t>
+              <w:t>valid=true</w:t>
             </w:r>
           </w:p>
         </w:tc>
@@ -1853,7 +1492,7 @@
       <w:tr>
         <w:tc>
           <w:tcPr>
-            <w:tcW w:type="dxa" w:w="2016"/>
+            <w:tcW w:type="dxa" w:w="2160"/>
             <w:vAlign w:val="center"/>
           </w:tcPr>
           <w:p>
@@ -1873,7 +1512,7 @@
         </w:tc>
         <w:tc>
           <w:tcPr>
-            <w:tcW w:type="dxa" w:w="3744"/>
+            <w:tcW w:type="dxa" w:w="3888"/>
             <w:vAlign w:val="center"/>
           </w:tcPr>
           <w:p>
@@ -1893,7 +1532,7 @@
         </w:tc>
         <w:tc>
           <w:tcPr>
-            <w:tcW w:type="dxa" w:w="3600"/>
+            <w:tcW w:type="dxa" w:w="3312"/>
             <w:vAlign w:val="center"/>
           </w:tcPr>
           <w:p>
@@ -1907,7 +1546,69 @@
                 <w:b w:val="0"/>
                 <w:sz w:val="19"/>
               </w:rPr>
-              <w:t>36개 결과 기록</w:t>
+              <w:t>36개 outcome 기록</w:t>
+            </w:r>
+          </w:p>
+        </w:tc>
+      </w:tr>
+      <w:tr>
+        <w:tc>
+          <w:tcPr>
+            <w:tcW w:type="dxa" w:w="2160"/>
+            <w:vAlign w:val="center"/>
+          </w:tcPr>
+          <w:p>
+            <w:pPr>
+              <w:spacing w:after="0"/>
+            </w:pPr>
+            <w:r/>
+            <w:r>
+              <w:rPr>
+                <w:rFonts w:ascii="Malgun Gothic" w:hAnsi="Malgun Gothic" w:eastAsia="Malgun Gothic"/>
+                <w:b w:val="0"/>
+                <w:sz w:val="19"/>
+              </w:rPr>
+              <w:t>정량 분석</w:t>
+            </w:r>
+          </w:p>
+        </w:tc>
+        <w:tc>
+          <w:tcPr>
+            <w:tcW w:type="dxa" w:w="3888"/>
+            <w:vAlign w:val="center"/>
+          </w:tcPr>
+          <w:p>
+            <w:pPr>
+              <w:spacing w:after="0"/>
+            </w:pPr>
+            <w:r/>
+            <w:r>
+              <w:rPr>
+                <w:rFonts w:ascii="Malgun Gothic" w:hAnsi="Malgun Gothic" w:eastAsia="Malgun Gothic"/>
+                <w:b w:val="0"/>
+                <w:sz w:val="19"/>
+              </w:rPr>
+              <w:t>server_recovery_statistics.sh</w:t>
+            </w:r>
+          </w:p>
+        </w:tc>
+        <w:tc>
+          <w:tcPr>
+            <w:tcW w:type="dxa" w:w="3312"/>
+            <w:vAlign w:val="center"/>
+          </w:tcPr>
+          <w:p>
+            <w:pPr>
+              <w:spacing w:after="0"/>
+            </w:pPr>
+            <w:r/>
+            <w:r>
+              <w:rPr>
+                <w:rFonts w:ascii="Malgun Gothic" w:hAnsi="Malgun Gothic" w:eastAsia="Malgun Gothic"/>
+                <w:b w:val="0"/>
+                <w:sz w:val="19"/>
+              </w:rPr>
+              <w:t>PNG/SVG/CSV/JSON 산출</w:t>
             </w:r>
           </w:p>
         </w:tc>
@@ -1925,7 +1626,7 @@
           <w:color w:val="2E74B5"/>
           <w:sz w:val="32"/>
         </w:rPr>
-        <w:t>6. 산출물</w:t>
+        <w:t>5. 산출물</w:t>
       </w:r>
     </w:p>
     <w:tbl>
@@ -1942,7 +1643,7 @@
       <w:tr>
         <w:tc>
           <w:tcPr>
-            <w:tcW w:type="dxa" w:w="3744"/>
+            <w:tcW w:type="dxa" w:w="3456"/>
             <w:vAlign w:val="center"/>
             <w:shd w:fill="F2F4F7"/>
           </w:tcPr>
@@ -1963,7 +1664,7 @@
         </w:tc>
         <w:tc>
           <w:tcPr>
-            <w:tcW w:type="dxa" w:w="5616"/>
+            <w:tcW w:type="dxa" w:w="5904"/>
             <w:vAlign w:val="center"/>
             <w:shd w:fill="F2F4F7"/>
           </w:tcPr>
@@ -1978,7 +1679,7 @@
                 <w:b/>
                 <w:sz w:val="19"/>
               </w:rPr>
-              <w:t>설명</w:t>
+              <w:t>위치</w:t>
             </w:r>
           </w:p>
         </w:tc>
@@ -1986,7 +1687,195 @@
       <w:tr>
         <w:tc>
           <w:tcPr>
-            <w:tcW w:type="dxa" w:w="3744"/>
+            <w:tcW w:type="dxa" w:w="3456"/>
+            <w:vAlign w:val="center"/>
+          </w:tcPr>
+          <w:p>
+            <w:pPr>
+              <w:spacing w:after="0"/>
+            </w:pPr>
+            <w:r/>
+            <w:r>
+              <w:rPr>
+                <w:rFonts w:ascii="Malgun Gothic" w:hAnsi="Malgun Gothic" w:eastAsia="Malgun Gothic"/>
+                <w:b w:val="0"/>
+                <w:sz w:val="19"/>
+              </w:rPr>
+              <w:t>요구사항 정의서</w:t>
+            </w:r>
+          </w:p>
+        </w:tc>
+        <w:tc>
+          <w:tcPr>
+            <w:tcW w:type="dxa" w:w="5904"/>
+            <w:vAlign w:val="center"/>
+          </w:tcPr>
+          <w:p>
+            <w:pPr>
+              <w:spacing w:after="0"/>
+            </w:pPr>
+            <w:r/>
+            <w:r>
+              <w:rPr>
+                <w:rFonts w:ascii="Malgun Gothic" w:hAnsi="Malgun Gothic" w:eastAsia="Malgun Gothic"/>
+                <w:b w:val="0"/>
+                <w:sz w:val="19"/>
+              </w:rPr>
+              <w:t>docs/submission/requirements_definition.md</w:t>
+            </w:r>
+          </w:p>
+        </w:tc>
+      </w:tr>
+      <w:tr>
+        <w:tc>
+          <w:tcPr>
+            <w:tcW w:type="dxa" w:w="3456"/>
+            <w:vAlign w:val="center"/>
+          </w:tcPr>
+          <w:p>
+            <w:pPr>
+              <w:spacing w:after="0"/>
+            </w:pPr>
+            <w:r/>
+            <w:r>
+              <w:rPr>
+                <w:rFonts w:ascii="Malgun Gothic" w:hAnsi="Malgun Gothic" w:eastAsia="Malgun Gothic"/>
+                <w:b w:val="0"/>
+                <w:sz w:val="19"/>
+              </w:rPr>
+              <w:t>Word 요구사항 정의서</w:t>
+            </w:r>
+          </w:p>
+        </w:tc>
+        <w:tc>
+          <w:tcPr>
+            <w:tcW w:type="dxa" w:w="5904"/>
+            <w:vAlign w:val="center"/>
+          </w:tcPr>
+          <w:p>
+            <w:pPr>
+              <w:spacing w:after="0"/>
+            </w:pPr>
+            <w:r/>
+            <w:r>
+              <w:rPr>
+                <w:rFonts w:ascii="Malgun Gothic" w:hAnsi="Malgun Gothic" w:eastAsia="Malgun Gothic"/>
+                <w:b w:val="0"/>
+                <w:sz w:val="19"/>
+              </w:rPr>
+              <w:t>docs/submission/requirements_definition.docx</w:t>
+            </w:r>
+          </w:p>
+        </w:tc>
+      </w:tr>
+      <w:tr>
+        <w:tc>
+          <w:tcPr>
+            <w:tcW w:type="dxa" w:w="3456"/>
+            <w:vAlign w:val="center"/>
+          </w:tcPr>
+          <w:p>
+            <w:pPr>
+              <w:spacing w:after="0"/>
+            </w:pPr>
+            <w:r/>
+            <w:r>
+              <w:rPr>
+                <w:rFonts w:ascii="Malgun Gothic" w:hAnsi="Malgun Gothic" w:eastAsia="Malgun Gothic"/>
+                <w:b w:val="0"/>
+                <w:sz w:val="19"/>
+              </w:rPr>
+              <w:t>설치 및 실행 가이드</w:t>
+            </w:r>
+          </w:p>
+        </w:tc>
+        <w:tc>
+          <w:tcPr>
+            <w:tcW w:type="dxa" w:w="5904"/>
+            <w:vAlign w:val="center"/>
+          </w:tcPr>
+          <w:p>
+            <w:pPr>
+              <w:spacing w:after="0"/>
+            </w:pPr>
+            <w:r/>
+            <w:r>
+              <w:rPr>
+                <w:rFonts w:ascii="Malgun Gothic" w:hAnsi="Malgun Gothic" w:eastAsia="Malgun Gothic"/>
+                <w:b w:val="0"/>
+                <w:sz w:val="19"/>
+              </w:rPr>
+              <w:t>docs/submission/install_and_run_guide.md</w:t>
+            </w:r>
+          </w:p>
+        </w:tc>
+      </w:tr>
+      <w:tr>
+        <w:tc>
+          <w:tcPr>
+            <w:tcW w:type="dxa" w:w="3456"/>
+            <w:vAlign w:val="center"/>
+          </w:tcPr>
+          <w:p>
+            <w:pPr>
+              <w:spacing w:after="0"/>
+            </w:pPr>
+            <w:r/>
+            <w:r>
+              <w:rPr>
+                <w:rFonts w:ascii="Malgun Gothic" w:hAnsi="Malgun Gothic" w:eastAsia="Malgun Gothic"/>
+                <w:b w:val="0"/>
+                <w:sz w:val="19"/>
+              </w:rPr>
+              <w:t>시험 가이드</w:t>
+            </w:r>
+          </w:p>
+        </w:tc>
+        <w:tc>
+          <w:tcPr>
+            <w:tcW w:type="dxa" w:w="5904"/>
+            <w:vAlign w:val="center"/>
+          </w:tcPr>
+          <w:p>
+            <w:pPr>
+              <w:spacing w:after="0"/>
+            </w:pPr>
+            <w:r/>
+            <w:r>
+              <w:rPr>
+                <w:rFonts w:ascii="Malgun Gothic" w:hAnsi="Malgun Gothic" w:eastAsia="Malgun Gothic"/>
+                <w:b w:val="0"/>
+                <w:sz w:val="19"/>
+              </w:rPr>
+              <w:t>docs/submission/test_guide.md</w:t>
+            </w:r>
+          </w:p>
+        </w:tc>
+      </w:tr>
+      <w:tr>
+        <w:tc>
+          <w:tcPr>
+            <w:tcW w:type="dxa" w:w="3456"/>
+            <w:vAlign w:val="center"/>
+          </w:tcPr>
+          <w:p>
+            <w:pPr>
+              <w:spacing w:after="0"/>
+            </w:pPr>
+            <w:r/>
+            <w:r>
+              <w:rPr>
+                <w:rFonts w:ascii="Malgun Gothic" w:hAnsi="Malgun Gothic" w:eastAsia="Malgun Gothic"/>
+                <w:b w:val="0"/>
+                <w:sz w:val="19"/>
+              </w:rPr>
+              <w:t>Agent Registry</w:t>
+            </w:r>
+          </w:p>
+        </w:tc>
+        <w:tc>
+          <w:tcPr>
+            <w:tcW w:type="dxa" w:w="5904"/>
             <w:vAlign w:val="center"/>
           </w:tcPr>
           <w:p>
@@ -2004,9 +1893,11 @@
             </w:r>
           </w:p>
         </w:tc>
+      </w:tr>
+      <w:tr>
         <w:tc>
           <w:tcPr>
-            <w:tcW w:type="dxa" w:w="5616"/>
+            <w:tcW w:type="dxa" w:w="3456"/>
             <w:vAlign w:val="center"/>
           </w:tcPr>
           <w:p>
@@ -2020,15 +1911,13 @@
                 <w:b w:val="0"/>
                 <w:sz w:val="19"/>
               </w:rPr>
-              <w:t>4-Agent 등록 관리 설정</w:t>
+              <w:t>Action/Reward 정책</w:t>
             </w:r>
           </w:p>
         </w:tc>
-      </w:tr>
-      <w:tr>
         <w:tc>
           <w:tcPr>
-            <w:tcW w:type="dxa" w:w="3744"/>
+            <w:tcW w:type="dxa" w:w="5904"/>
             <w:vAlign w:val="center"/>
           </w:tcPr>
           <w:p>
@@ -2042,13 +1931,15 @@
                 <w:b w:val="0"/>
                 <w:sz w:val="19"/>
               </w:rPr>
-              <w:t>config/inference_optimization.json</w:t>
+              <w:t>docs/design/agent_action_reward_policy.md</w:t>
             </w:r>
           </w:p>
         </w:tc>
+      </w:tr>
+      <w:tr>
         <w:tc>
           <w:tcPr>
-            <w:tcW w:type="dxa" w:w="5616"/>
+            <w:tcW w:type="dxa" w:w="3456"/>
             <w:vAlign w:val="center"/>
           </w:tcPr>
           <w:p>
@@ -2062,15 +1953,13 @@
                 <w:b w:val="0"/>
                 <w:sz w:val="19"/>
               </w:rPr>
-              <w:t>CPU/GPU VM 추론 배치 정책</w:t>
+              <w:t>Recovery 실험 결과</w:t>
             </w:r>
           </w:p>
         </w:tc>
-      </w:tr>
-      <w:tr>
         <w:tc>
           <w:tcPr>
-            <w:tcW w:type="dxa" w:w="3744"/>
+            <w:tcW w:type="dxa" w:w="5904"/>
             <w:vAlign w:val="center"/>
           </w:tcPr>
           <w:p>
@@ -2084,13 +1973,15 @@
                 <w:b w:val="0"/>
                 <w:sz w:val="19"/>
               </w:rPr>
-              <w:t>go/aiops-guard</w:t>
+              <w:t>runs/recovery-action-pilot/&lt;run&gt;/</w:t>
             </w:r>
           </w:p>
         </w:tc>
+      </w:tr>
+      <w:tr>
         <w:tc>
           <w:tcPr>
-            <w:tcW w:type="dxa" w:w="5616"/>
+            <w:tcW w:type="dxa" w:w="3456"/>
             <w:vAlign w:val="center"/>
           </w:tcPr>
           <w:p>
@@ -2104,15 +1995,13 @@
                 <w:b w:val="0"/>
                 <w:sz w:val="19"/>
               </w:rPr>
-              <w:t>Go 언어 기반 최종 action guard</w:t>
+              <w:t>정량 분석 그래프</w:t>
             </w:r>
           </w:p>
         </w:tc>
-      </w:tr>
-      <w:tr>
         <w:tc>
           <w:tcPr>
-            <w:tcW w:type="dxa" w:w="3744"/>
+            <w:tcW w:type="dxa" w:w="5904"/>
             <w:vAlign w:val="center"/>
           </w:tcPr>
           <w:p>
@@ -2126,117 +2015,75 @@
                 <w:b w:val="0"/>
                 <w:sz w:val="19"/>
               </w:rPr>
-              <w:t>docs/functional_api_guide.md</w:t>
-            </w:r>
-          </w:p>
-        </w:tc>
-        <w:tc>
-          <w:tcPr>
-            <w:tcW w:type="dxa" w:w="5616"/>
-            <w:vAlign w:val="center"/>
-          </w:tcPr>
-          <w:p>
-            <w:pPr>
-              <w:spacing w:after="0"/>
-            </w:pPr>
-            <w:r/>
-            <w:r>
-              <w:rPr>
-                <w:rFonts w:ascii="Malgun Gothic" w:hAnsi="Malgun Gothic" w:eastAsia="Malgun Gothic"/>
-                <w:b w:val="0"/>
-                <w:sz w:val="19"/>
-              </w:rPr>
-              <w:t>기능/API 사용 가이드</w:t>
-            </w:r>
-          </w:p>
-        </w:tc>
-      </w:tr>
-      <w:tr>
-        <w:tc>
-          <w:tcPr>
-            <w:tcW w:type="dxa" w:w="3744"/>
-            <w:vAlign w:val="center"/>
-          </w:tcPr>
-          <w:p>
-            <w:pPr>
-              <w:spacing w:after="0"/>
-            </w:pPr>
-            <w:r/>
-            <w:r>
-              <w:rPr>
-                <w:rFonts w:ascii="Malgun Gothic" w:hAnsi="Malgun Gothic" w:eastAsia="Malgun Gothic"/>
-                <w:b w:val="0"/>
-                <w:sz w:val="19"/>
-              </w:rPr>
-              <w:t>docs/test_guide.md</w:t>
-            </w:r>
-          </w:p>
-        </w:tc>
-        <w:tc>
-          <w:tcPr>
-            <w:tcW w:type="dxa" w:w="5616"/>
-            <w:vAlign w:val="center"/>
-          </w:tcPr>
-          <w:p>
-            <w:pPr>
-              <w:spacing w:after="0"/>
-            </w:pPr>
-            <w:r/>
-            <w:r>
-              <w:rPr>
-                <w:rFonts w:ascii="Malgun Gothic" w:hAnsi="Malgun Gothic" w:eastAsia="Malgun Gothic"/>
-                <w:b w:val="0"/>
-                <w:sz w:val="19"/>
-              </w:rPr>
-              <w:t>시험 검증 가이드</w:t>
-            </w:r>
-          </w:p>
-        </w:tc>
-      </w:tr>
-      <w:tr>
-        <w:tc>
-          <w:tcPr>
-            <w:tcW w:type="dxa" w:w="3744"/>
-            <w:vAlign w:val="center"/>
-          </w:tcPr>
-          <w:p>
-            <w:pPr>
-              <w:spacing w:after="0"/>
-            </w:pPr>
-            <w:r/>
-            <w:r>
-              <w:rPr>
-                <w:rFonts w:ascii="Malgun Gothic" w:hAnsi="Malgun Gothic" w:eastAsia="Malgun Gothic"/>
-                <w:b w:val="0"/>
-                <w:sz w:val="19"/>
-              </w:rPr>
-              <w:t>docs/requirements_definition.docx</w:t>
-            </w:r>
-          </w:p>
-        </w:tc>
-        <w:tc>
-          <w:tcPr>
-            <w:tcW w:type="dxa" w:w="5616"/>
-            <w:vAlign w:val="center"/>
-          </w:tcPr>
-          <w:p>
-            <w:pPr>
-              <w:spacing w:after="0"/>
-            </w:pPr>
-            <w:r/>
-            <w:r>
-              <w:rPr>
-                <w:rFonts w:ascii="Malgun Gothic" w:hAnsi="Malgun Gothic" w:eastAsia="Malgun Gothic"/>
-                <w:b w:val="0"/>
-                <w:sz w:val="19"/>
-              </w:rPr>
-              <w:t>제출용 요구사항 정의서</w:t>
+              <w:t>runs/recovery-action-pilot/&lt;run&gt;/statistics/</w:t>
             </w:r>
           </w:p>
         </w:tc>
       </w:tr>
     </w:tbl>
     <w:p/>
+    <w:p>
+      <w:pPr>
+        <w:pStyle w:val="Heading1"/>
+      </w:pPr>
+      <w:r>
+        <w:rPr>
+          <w:rFonts w:ascii="Malgun Gothic" w:hAnsi="Malgun Gothic" w:eastAsia="Malgun Gothic"/>
+          <w:b/>
+          <w:color w:val="2E74B5"/>
+          <w:sz w:val="32"/>
+        </w:rPr>
+        <w:t>6. 제외 범위</w:t>
+      </w:r>
+    </w:p>
+    <w:p>
+      <w:pPr>
+        <w:pStyle w:val="ListBullet"/>
+      </w:pPr>
+      <w:r>
+        <w:rPr>
+          <w:rFonts w:ascii="Malgun Gothic" w:hAnsi="Malgun Gothic" w:eastAsia="Malgun Gothic"/>
+          <w:sz w:val="21"/>
+        </w:rPr>
+        <w:t>Ops LLM 모델 선정 기능은 연구 본체에서 제거한다.</w:t>
+      </w:r>
+    </w:p>
+    <w:p>
+      <w:pPr>
+        <w:pStyle w:val="ListBullet"/>
+      </w:pPr>
+      <w:r>
+        <w:rPr>
+          <w:rFonts w:ascii="Malgun Gothic" w:hAnsi="Malgun Gothic" w:eastAsia="Malgun Gothic"/>
+          <w:sz w:val="21"/>
+        </w:rPr>
+        <w:t>CPU/GPU VM 기반 AI App 배치 기능은 연구 본체에서 제거한다.</w:t>
+      </w:r>
+    </w:p>
+    <w:p>
+      <w:pPr>
+        <w:pStyle w:val="ListBullet"/>
+      </w:pPr>
+      <w:r>
+        <w:rPr>
+          <w:rFonts w:ascii="Malgun Gothic" w:hAnsi="Malgun Gothic" w:eastAsia="Malgun Gothic"/>
+          <w:sz w:val="21"/>
+        </w:rPr>
+        <w:t>AI App deployment manifest 생성은 연구 본체에서 제거한다.</w:t>
+      </w:r>
+    </w:p>
+    <w:p>
+      <w:pPr>
+        <w:pStyle w:val="ListBullet"/>
+      </w:pPr>
+      <w:r>
+        <w:rPr>
+          <w:rFonts w:ascii="Malgun Gothic" w:hAnsi="Malgun Gothic" w:eastAsia="Malgun Gothic"/>
+          <w:sz w:val="21"/>
+        </w:rPr>
+        <w:t>Swagger/OpenAPI 서버는 현재 연구 범위가 아니다.</w:t>
+      </w:r>
+    </w:p>
     <w:p>
       <w:pPr>
         <w:pStyle w:val="Heading1"/>
@@ -2256,7 +2103,11 @@
         <w:pStyle w:val="ListBullet"/>
       </w:pPr>
       <w:r>
-        <w:t>single-agent baseline 및 Agent 제거 ablation 실험</w:t>
+        <w:rPr>
+          <w:rFonts w:ascii="Malgun Gothic" w:hAnsi="Malgun Gothic" w:eastAsia="Malgun Gothic"/>
+          <w:sz w:val="21"/>
+        </w:rPr>
+        <w:t>single-agent baseline 비교</w:t>
       </w:r>
     </w:p>
     <w:p>
@@ -2264,7 +2115,11 @@
         <w:pStyle w:val="ListBullet"/>
       </w:pPr>
       <w:r>
-        <w:t>AutoGen multi-round real action 선택 실험</w:t>
+        <w:rPr>
+          <w:rFonts w:ascii="Malgun Gothic" w:hAnsi="Malgun Gothic" w:eastAsia="Malgun Gothic"/>
+          <w:sz w:val="21"/>
+        </w:rPr>
+        <w:t>Agent 제거 ablation 실험</w:t>
       </w:r>
     </w:p>
     <w:p>
@@ -2272,7 +2127,11 @@
         <w:pStyle w:val="ListBullet"/>
       </w:pPr>
       <w:r>
-        <w:t>실제 GPU/NPU Kubernetes scheduling과 모델 추론 서비스 연동</w:t>
+        <w:rPr>
+          <w:rFonts w:ascii="Malgun Gothic" w:hAnsi="Malgun Gothic" w:eastAsia="Malgun Gothic"/>
+          <w:sz w:val="21"/>
+        </w:rPr>
+        <w:t>reward 민감도 분석</w:t>
       </w:r>
     </w:p>
     <w:p>
@@ -2280,7 +2139,23 @@
         <w:pStyle w:val="ListBullet"/>
       </w:pPr>
       <w:r>
-        <w:t>HTTP API 서버 기반 Agent Registry 관리 기능 구현</w:t>
+        <w:rPr>
+          <w:rFonts w:ascii="Malgun Gothic" w:hAnsi="Malgun Gothic" w:eastAsia="Malgun Gothic"/>
+          <w:sz w:val="21"/>
+        </w:rPr>
+        <w:t>AutoGen multi-round real action 선택</w:t>
+      </w:r>
+    </w:p>
+    <w:p>
+      <w:pPr>
+        <w:pStyle w:val="ListBullet"/>
+      </w:pPr>
+      <w:r>
+        <w:rPr>
+          <w:rFonts w:ascii="Malgun Gothic" w:hAnsi="Malgun Gothic" w:eastAsia="Malgun Gothic"/>
+          <w:sz w:val="21"/>
+        </w:rPr>
+        <w:t>Prometheus metric과 log enrichment 기반 full evidence fusion</w:t>
       </w:r>
     </w:p>
     <w:sectPr>

</xml_diff>

<commit_message>
Remove leftover service extension references
</commit_message>
<xml_diff>
--- a/docs/submission/requirements_definition.docx
+++ b/docs/submission/requirements_definition.docx
@@ -2033,69 +2033,7 @@
           <w:color w:val="2E74B5"/>
           <w:sz w:val="32"/>
         </w:rPr>
-        <w:t>6. 제외 범위</w:t>
-      </w:r>
-    </w:p>
-    <w:p>
-      <w:pPr>
-        <w:pStyle w:val="ListBullet"/>
-      </w:pPr>
-      <w:r>
-        <w:rPr>
-          <w:rFonts w:ascii="Malgun Gothic" w:hAnsi="Malgun Gothic" w:eastAsia="Malgun Gothic"/>
-          <w:sz w:val="21"/>
-        </w:rPr>
-        <w:t>Ops LLM 모델 선정 기능은 연구 본체에서 제거한다.</w:t>
-      </w:r>
-    </w:p>
-    <w:p>
-      <w:pPr>
-        <w:pStyle w:val="ListBullet"/>
-      </w:pPr>
-      <w:r>
-        <w:rPr>
-          <w:rFonts w:ascii="Malgun Gothic" w:hAnsi="Malgun Gothic" w:eastAsia="Malgun Gothic"/>
-          <w:sz w:val="21"/>
-        </w:rPr>
-        <w:t>CPU/GPU VM 기반 AI App 배치 기능은 연구 본체에서 제거한다.</w:t>
-      </w:r>
-    </w:p>
-    <w:p>
-      <w:pPr>
-        <w:pStyle w:val="ListBullet"/>
-      </w:pPr>
-      <w:r>
-        <w:rPr>
-          <w:rFonts w:ascii="Malgun Gothic" w:hAnsi="Malgun Gothic" w:eastAsia="Malgun Gothic"/>
-          <w:sz w:val="21"/>
-        </w:rPr>
-        <w:t>AI App deployment manifest 생성은 연구 본체에서 제거한다.</w:t>
-      </w:r>
-    </w:p>
-    <w:p>
-      <w:pPr>
-        <w:pStyle w:val="ListBullet"/>
-      </w:pPr>
-      <w:r>
-        <w:rPr>
-          <w:rFonts w:ascii="Malgun Gothic" w:hAnsi="Malgun Gothic" w:eastAsia="Malgun Gothic"/>
-          <w:sz w:val="21"/>
-        </w:rPr>
-        <w:t>Swagger/OpenAPI 서버는 현재 연구 범위가 아니다.</w:t>
-      </w:r>
-    </w:p>
-    <w:p>
-      <w:pPr>
-        <w:pStyle w:val="Heading1"/>
-      </w:pPr>
-      <w:r>
-        <w:rPr>
-          <w:rFonts w:ascii="Malgun Gothic" w:hAnsi="Malgun Gothic" w:eastAsia="Malgun Gothic"/>
-          <w:b/>
-          <w:color w:val="2E74B5"/>
-          <w:sz w:val="32"/>
-        </w:rPr>
-        <w:t>7. 향후 확장</w:t>
+        <w:t>6. 향후 확장</w:t>
       </w:r>
     </w:p>
     <w:p>

</xml_diff>